<commit_message>
Mô tả nội dung bạn vừa cập nhật (VD: Fix bug, add new feature)
</commit_message>
<xml_diff>
--- a/SE205362_DaoDuyHoang.docx
+++ b/SE205362_DaoDuyHoang.docx
@@ -20839,7 +20839,6 @@
           <w:lang w:val="en-US"/>
         </w:rPr>
       </w:pPr>
-      <w:bookmarkStart w:id="0" w:name="_GoBack"/>
       <w:r>
         <w:rPr>
           <w:rFonts w:hint="default" w:ascii="Times New Roman" w:hAnsi="Times New Roman" w:cs="Times New Roman"/>
@@ -20847,9 +20846,9 @@
         </w:rPr>
         <w:drawing>
           <wp:inline distT="0" distB="0" distL="114300" distR="114300">
-            <wp:extent cx="5096510" cy="9550400"/>
-            <wp:effectExtent l="0" t="0" r="8890" b="0"/>
-            <wp:docPr id="3" name="Picture 3" descr="Str Matchrecord Flow-2026-10-08-030313"/>
+            <wp:extent cx="4838700" cy="9595485"/>
+            <wp:effectExtent l="0" t="0" r="0" b="5715"/>
+            <wp:docPr id="5" name="Picture 5" descr="Str Matchrecord Flow-2026-10-09-143739"/>
             <wp:cNvGraphicFramePr>
               <a:graphicFrameLocks xmlns:a="http://schemas.openxmlformats.org/drawingml/2006/main" noChangeAspect="1"/>
             </wp:cNvGraphicFramePr>
@@ -20857,7 +20856,7 @@
               <a:graphicData uri="http://schemas.openxmlformats.org/drawingml/2006/picture">
                 <pic:pic xmlns:pic="http://schemas.openxmlformats.org/drawingml/2006/picture">
                   <pic:nvPicPr>
-                    <pic:cNvPr id="3" name="Picture 3" descr="Str Matchrecord Flow-2026-10-08-030313"/>
+                    <pic:cNvPr id="5" name="Picture 5" descr="Str Matchrecord Flow-2026-10-09-143739"/>
                     <pic:cNvPicPr>
                       <a:picLocks noChangeAspect="1"/>
                     </pic:cNvPicPr>
@@ -20871,7 +20870,7 @@
                   <pic:spPr>
                     <a:xfrm>
                       <a:off x="0" y="0"/>
-                      <a:ext cx="5096510" cy="9550400"/>
+                      <a:ext cx="4838700" cy="9595485"/>
                     </a:xfrm>
                     <a:prstGeom prst="rect">
                       <a:avLst/>
@@ -20883,7 +20882,6 @@
           </wp:inline>
         </w:drawing>
       </w:r>
-      <w:bookmarkEnd w:id="0"/>
     </w:p>
     <w:p>
       <w:pPr>
@@ -21076,6 +21074,7 @@
           <w:lang w:val="en-US"/>
         </w:rPr>
       </w:pPr>
+      <w:bookmarkStart w:id="0" w:name="_GoBack"/>
       <w:r>
         <w:rPr>
           <w:rFonts w:hint="default" w:ascii="Times New Roman" w:hAnsi="Times New Roman" w:eastAsia="Times New Roman" w:cs="Times New Roman"/>
@@ -21088,9 +21087,9 @@
         </w:rPr>
         <w:drawing>
           <wp:inline distT="0" distB="0" distL="114300" distR="114300">
-            <wp:extent cx="7256780" cy="5539105"/>
-            <wp:effectExtent l="0" t="0" r="7620" b="10795"/>
-            <wp:docPr id="2" name="Picture 2" descr="Customer Discount-2026-10-08-030002"/>
+            <wp:extent cx="7256780" cy="6371590"/>
+            <wp:effectExtent l="0" t="0" r="7620" b="3810"/>
+            <wp:docPr id="10" name="Picture 10" descr="Customer Discount-2026-10-09-143819"/>
             <wp:cNvGraphicFramePr>
               <a:graphicFrameLocks xmlns:a="http://schemas.openxmlformats.org/drawingml/2006/main" noChangeAspect="1"/>
             </wp:cNvGraphicFramePr>
@@ -21098,7 +21097,7 @@
               <a:graphicData uri="http://schemas.openxmlformats.org/drawingml/2006/picture">
                 <pic:pic xmlns:pic="http://schemas.openxmlformats.org/drawingml/2006/picture">
                   <pic:nvPicPr>
-                    <pic:cNvPr id="2" name="Picture 2" descr="Customer Discount-2026-10-08-030002"/>
+                    <pic:cNvPr id="10" name="Picture 10" descr="Customer Discount-2026-10-09-143819"/>
                     <pic:cNvPicPr>
                       <a:picLocks noChangeAspect="1"/>
                     </pic:cNvPicPr>
@@ -21112,7 +21111,7 @@
                   <pic:spPr>
                     <a:xfrm>
                       <a:off x="0" y="0"/>
-                      <a:ext cx="7256780" cy="5539105"/>
+                      <a:ext cx="7256780" cy="6371590"/>
                     </a:xfrm>
                     <a:prstGeom prst="rect">
                       <a:avLst/>
@@ -21124,6 +21123,7 @@
           </wp:inline>
         </w:drawing>
       </w:r>
+      <w:bookmarkEnd w:id="0"/>
     </w:p>
     <w:p>
       <w:pPr>

</xml_diff>